<commit_message>
removing quotation marks on een, leaving declarations and writing data inside the table
</commit_message>
<xml_diff>
--- a/assets/EDIH/Potpisna lista.docx
+++ b/assets/EDIH/Potpisna lista.docx
@@ -61,7 +61,7 @@
           <w:sz w:val="20"/>
           <w:szCs w:val="20"/>
         </w:rPr>
-        <w:t>___________________________________________________________________________________</w:t>
+        <w:t>__</w:t>
       </w:r>
       <w:r>
         <w:rPr>
@@ -69,7 +69,7 @@
           <w:sz w:val="20"/>
           <w:szCs w:val="20"/>
         </w:rPr>
-        <w:t>_____</w:t>
+        <w:t xml:space="preserve">educationName, location, date </w:t>
       </w:r>
       <w:r>
         <w:rPr>
@@ -77,15 +77,7 @@
           <w:sz w:val="20"/>
           <w:szCs w:val="20"/>
         </w:rPr>
-        <w:t>____</w:t>
-      </w:r>
-      <w:r>
-        <w:rPr>
-          <w:rFonts w:ascii="Montserrat" w:hAnsi="Montserrat"/>
-          <w:sz w:val="20"/>
-          <w:szCs w:val="20"/>
-        </w:rPr>
-        <w:t>__</w:t>
+        <w:t>_______________________________________________</w:t>
       </w:r>
     </w:p>
     <w:p>

</xml_diff>